<commit_message>
Integrate recommendation feature branches
</commit_message>
<xml_diff>
--- a/api_endpoints_detailed.docx
+++ b/api_endpoints_detailed.docx
@@ -1,6 +1,6 @@
 
 <file path=word/document.xml><?xml version="1.0" encoding="utf-8"?>
-<w:document xmlns:wpc="http://schemas.microsoft.com/office/word/2010/wordprocessingCanvas" xmlns:mo="http://schemas.microsoft.com/office/mac/office/2008/main" xmlns:mc="http://schemas.openxmlformats.org/markup-compatibility/2006" xmlns:mv="urn:schemas-microsoft-com:mac:vml" xmlns:o="urn:schemas-microsoft-com:office:office" xmlns:r="http://schemas.openxmlformats.org/officeDocument/2006/relationships" xmlns:m="http://schemas.openxmlformats.org/officeDocument/2006/math" xmlns:v="urn:schemas-microsoft-com:vml" xmlns:wp14="http://schemas.microsoft.com/office/word/2010/wordprocessingDrawing" xmlns:wp="http://schemas.openxmlformats.org/drawingml/2006/wordprocessingDrawing" xmlns:w10="urn:schemas-microsoft-com:office:word" xmlns:w="http://schemas.openxmlformats.org/wordprocessingml/2006/main" xmlns:w14="http://schemas.microsoft.com/office/word/2010/wordml" xmlns:wpg="http://schemas.microsoft.com/office/word/2010/wordprocessingGroup" xmlns:wpi="http://schemas.microsoft.com/office/word/2010/wordprocessingInk" xmlns:wne="http://schemas.microsoft.com/office/word/2006/wordml" xmlns:wps="http://schemas.microsoft.com/office/word/2010/wordprocessingShape" mc:Ignorable="w14 wp14">
+<w:document xmlns:ns1="http://schemas.openxmlformats.org/markup-compatibility/2006" xmlns:w="http://schemas.openxmlformats.org/wordprocessingml/2006/main" ns1:Ignorable="w14 wp14">
   <w:body>
     <w:p>
       <w:pPr>
@@ -10,6 +10,16 @@
         <w:t>Danh sách API Endpoints của Dự án ComputationalThinkingHCMUS (Chi tiết)</w:t>
       </w:r>
     </w:p>
+    <w:p>
+      <w:r>
+        <w:t>Base path chính: /api/v1. Endpoint /health nằm ở root để kiểm tra trạng thái server.</w:t>
+      </w:r>
+    </w:p>
+    <w:p>
+      <w:r>
+        <w:t>Các endpoint có ghi Bearer token cần header Authorization: Bearer &lt;access_token&gt;.</w:t>
+      </w:r>
+    </w:p>
     <w:tbl>
       <w:tblPr>
         <w:tblStyle w:val="TableGrid"/>
@@ -17,11 +27,11 @@
         <w:tblLook w:firstColumn="1" w:firstRow="1" w:lastColumn="0" w:lastRow="0" w:noHBand="0" w:noVBand="1" w:val="04A0"/>
       </w:tblPr>
       <w:tblGrid>
-        <w:gridCol w:w="1728"/>
-        <w:gridCol w:w="1728"/>
-        <w:gridCol w:w="1728"/>
-        <w:gridCol w:w="1728"/>
-        <w:gridCol w:w="1728"/>
+        <w:gridCol w:w="1150"/>
+        <w:gridCol w:w="2300"/>
+        <w:gridCol w:w="2200"/>
+        <w:gridCol w:w="2600"/>
+        <w:gridCol w:w="3600"/>
       </w:tblGrid>
       <w:tr>
         <w:tc>
@@ -82,7 +92,7 @@
           </w:tcPr>
           <w:p>
             <w:r>
-              <w:t>POST</w:t>
+              <w:t>GET</w:t>
             </w:r>
           </w:p>
         </w:tc>
@@ -92,7 +102,7 @@
           </w:tcPr>
           <w:p>
             <w:r>
-              <w:t>/auth/login</w:t>
+              <w:t>/health</w:t>
             </w:r>
           </w:p>
         </w:tc>
@@ -102,7 +112,7 @@
           </w:tcPr>
           <w:p>
             <w:r>
-              <w:t>Xác thực người dùng</w:t>
+              <w:t>Kiểm tra trạng thái app và database</w:t>
             </w:r>
           </w:p>
         </w:tc>
@@ -112,7 +122,7 @@
           </w:tcPr>
           <w:p>
             <w:r>
-              <w:t>LoginRequest (identifier, password)</w:t>
+              <w:t>Không có</w:t>
             </w:r>
           </w:p>
         </w:tc>
@@ -122,7 +132,7 @@
           </w:tcPr>
           <w:p>
             <w:r>
-              <w:t>message (str), user (UserResponse), access_token (str | None)</w:t>
+              <w:t>status (str), database (str), driver (str)</w:t>
             </w:r>
           </w:p>
         </w:tc>
@@ -144,7 +154,59 @@
           </w:tcPr>
           <w:p>
             <w:r>
-              <w:t>/auth/register</w:t>
+              <w:t>/api/v1/auth/login</w:t>
+            </w:r>
+          </w:p>
+        </w:tc>
+        <w:tc>
+          <w:tcPr>
+            <w:tcW w:type="dxa" w:w="1728"/>
+          </w:tcPr>
+          <w:p>
+            <w:r>
+              <w:t>Xác thực người dùng</w:t>
+            </w:r>
+          </w:p>
+        </w:tc>
+        <w:tc>
+          <w:tcPr>
+            <w:tcW w:type="dxa" w:w="1728"/>
+          </w:tcPr>
+          <w:p>
+            <w:r>
+              <w:t>LoginRequest: identifier, password</w:t>
+            </w:r>
+          </w:p>
+        </w:tc>
+        <w:tc>
+          <w:tcPr>
+            <w:tcW w:type="dxa" w:w="1728"/>
+          </w:tcPr>
+          <w:p>
+            <w:r>
+              <w:t>AuthResponse: message, user (UserResponse), access_token</w:t>
+            </w:r>
+          </w:p>
+        </w:tc>
+      </w:tr>
+      <w:tr>
+        <w:tc>
+          <w:tcPr>
+            <w:tcW w:type="dxa" w:w="1728"/>
+          </w:tcPr>
+          <w:p>
+            <w:r>
+              <w:t>POST</w:t>
+            </w:r>
+          </w:p>
+        </w:tc>
+        <w:tc>
+          <w:tcPr>
+            <w:tcW w:type="dxa" w:w="1728"/>
+          </w:tcPr>
+          <w:p>
+            <w:r>
+              <w:t>/api/v1/auth/register</w:t>
             </w:r>
           </w:p>
         </w:tc>
@@ -164,7 +226,7 @@
           </w:tcPr>
           <w:p>
             <w:r>
-              <w:t>RegisterRequest</w:t>
+              <w:t>RegisterRequest: user_name, email, password</w:t>
             </w:r>
           </w:p>
         </w:tc>
@@ -174,7 +236,7 @@
           </w:tcPr>
           <w:p>
             <w:r>
-              <w:t>message (str), user (UserResponse), access_token (str | None)</w:t>
+              <w:t>AuthResponse: message, user (UserResponse), access_token</w:t>
             </w:r>
           </w:p>
         </w:tc>
@@ -196,7 +258,7 @@
           </w:tcPr>
           <w:p>
             <w:r>
-              <w:t>/auth/profile</w:t>
+              <w:t>/api/v1/auth/profile</w:t>
             </w:r>
           </w:p>
         </w:tc>
@@ -206,7 +268,7 @@
           </w:tcPr>
           <w:p>
             <w:r>
-              <w:t>Cập nhật hồ sơ</w:t>
+              <w:t>Cập nhật hồ sơ người dùng hiện tại</w:t>
             </w:r>
           </w:p>
         </w:tc>
@@ -216,7 +278,7 @@
           </w:tcPr>
           <w:p>
             <w:r>
-              <w:t>UpdateProfileRequest</w:t>
+              <w:t>Bearer token; UpdateProfileRequest: first_name, last_name, birth_date, gender, address</w:t>
             </w:r>
           </w:p>
         </w:tc>
@@ -226,7 +288,7 @@
           </w:tcPr>
           <w:p>
             <w:r>
-              <w:t>message (str), user (UserResponse), access_token (str | None)</w:t>
+              <w:t>AuthResponse: message, user (UserResponse), access_token (thường là null)</w:t>
             </w:r>
           </w:p>
         </w:tc>
@@ -248,7 +310,7 @@
           </w:tcPr>
           <w:p>
             <w:r>
-              <w:t>/places/resolve-point</w:t>
+              <w:t>/api/v1/places/resolve-point</w:t>
             </w:r>
           </w:p>
         </w:tc>
@@ -258,7 +320,7 @@
           </w:tcPr>
           <w:p>
             <w:r>
-              <w:t>Chuyển đổi tọa độ thành địa điểm</w:t>
+              <w:t>Chuyển tọa độ thành địa điểm trong catalog</w:t>
             </w:r>
           </w:p>
         </w:tc>
@@ -268,7 +330,7 @@
           </w:tcPr>
           <w:p>
             <w:r>
-              <w:t>ResolvePlacePointRequest (latitude, longitude)</w:t>
+              <w:t>ResolvePlacePointRequest: latitude, longitude</w:t>
             </w:r>
           </w:p>
         </w:tc>
@@ -278,7 +340,7 @@
           </w:tcPr>
           <w:p>
             <w:r>
-              <w:t>id (int|str), name (str), address (str), category (str|None), rating (float|None), review_count (int), distance_km (float|None), latitude (float|None), longitude (float|None), price_level (int|None), price_range (str|None), open_now (bool|None), photo_url (str|None), contact_phone (str|None), primary_type (str|None), website (str|None), score (float|None), can_view (bool), can_save (bool), is_local_only (bool)</w:t>
+              <w:t>PlaceResponse: id, name, address, category, rating, review_count, distance_km, latitude, longitude, price_level, price_range, open_now, photo_url, contact_phone, primary_type, website, score, can_view, can_save, is_local_only</w:t>
             </w:r>
           </w:p>
         </w:tc>
@@ -300,7 +362,7 @@
           </w:tcPr>
           <w:p>
             <w:r>
-              <w:t>/places/{place_id}</w:t>
+              <w:t>/api/v1/places/{place_id}</w:t>
             </w:r>
           </w:p>
         </w:tc>
@@ -330,7 +392,7 @@
           </w:tcPr>
           <w:p>
             <w:r>
-              <w:t>PlaceResponse + description (str|None), opening_hours (dict), popular_times (dict), images (list[str]), about (list[dict]), status (str|None), place_id (str|None), cid (str|None)</w:t>
+              <w:t>PlaceDetailResponse: id, name, address, category, rating, review_count, distance_km, latitude, longitude, price_level, price_range, open_now, photo_url, contact_phone, primary_type, website, score, can_view, can_save, is_local_only, description, opening_hours, popular_times, images, about, status, place_id, cid</w:t>
             </w:r>
           </w:p>
         </w:tc>
@@ -352,7 +414,7 @@
           </w:tcPr>
           <w:p>
             <w:r>
-              <w:t>/recommendations</w:t>
+              <w:t>/api/v1/recommendations</w:t>
             </w:r>
           </w:p>
         </w:tc>
@@ -372,7 +434,7 @@
           </w:tcPr>
           <w:p>
             <w:r>
-              <w:t>query, latitude, longitude (query params)</w:t>
+              <w:t>Bearer token + profile hoàn chỉnh; query params: query, entertainment_type, budget_level, companion_type, start_time, max_distance_km, require_open_now, min_rating, latitude, longitude</w:t>
             </w:r>
           </w:p>
         </w:tc>
@@ -382,7 +444,59 @@
           </w:tcPr>
           <w:p>
             <w:r>
-              <w:t>Dictionary chứa danh sách places (tương tự PlaceResponse)</w:t>
+              <w:t>{ items: list[PlaceResponse-like dict] }</w:t>
+            </w:r>
+          </w:p>
+        </w:tc>
+      </w:tr>
+      <w:tr>
+        <w:tc>
+          <w:tcPr>
+            <w:tcW w:type="dxa" w:w="1728"/>
+          </w:tcPr>
+          <w:p>
+            <w:r>
+              <w:t>POST</w:t>
+            </w:r>
+          </w:p>
+        </w:tc>
+        <w:tc>
+          <w:tcPr>
+            <w:tcW w:type="dxa" w:w="1728"/>
+          </w:tcPr>
+          <w:p>
+            <w:r>
+              <w:t>/api/v1/recommendations/picks/{place_id}</w:t>
+            </w:r>
+          </w:p>
+        </w:tc>
+        <w:tc>
+          <w:tcPr>
+            <w:tcW w:type="dxa" w:w="1728"/>
+          </w:tcPr>
+          <w:p>
+            <w:r>
+              <w:t>Ghi nhận địa điểm user đã chọn để cá nhân hóa gợi ý</w:t>
+            </w:r>
+          </w:p>
+        </w:tc>
+        <w:tc>
+          <w:tcPr>
+            <w:tcW w:type="dxa" w:w="1728"/>
+          </w:tcPr>
+          <w:p>
+            <w:r>
+              <w:t>Bearer token; place_id (path param)</w:t>
+            </w:r>
+          </w:p>
+        </w:tc>
+        <w:tc>
+          <w:tcPr>
+            <w:tcW w:type="dxa" w:w="1728"/>
+          </w:tcPr>
+          <w:p>
+            <w:r>
+              <w:t>HTTP 204, không có body</w:t>
             </w:r>
           </w:p>
         </w:tc>
@@ -404,7 +518,7 @@
           </w:tcPr>
           <w:p>
             <w:r>
-              <w:t>/routes/plan</w:t>
+              <w:t>/api/v1/routes/plan</w:t>
             </w:r>
           </w:p>
         </w:tc>
@@ -424,7 +538,7 @@
           </w:tcPr>
           <w:p>
             <w:r>
-              <w:t>origin, destination, travel_mode (query params)</w:t>
+              <w:t>Bearer token + profile hoàn chỉnh; query params: origin, destination, travel_mode</w:t>
             </w:r>
           </w:p>
         </w:tc>
@@ -434,7 +548,7 @@
           </w:tcPr>
           <w:p>
             <w:r>
-              <w:t>origin (str), destination (str), distance_text (str), duration_text (str), distance_km (float|None), duration_seconds (int|None), path (list[RoutePoint]), steps (list[RouteStep])</w:t>
+              <w:t>RouteResponse: origin, destination, distance_text, duration_text, distance_km, duration_seconds, path (list[RoutePoint]), steps (list[RouteStep])</w:t>
             </w:r>
           </w:p>
         </w:tc>
@@ -456,7 +570,7 @@
           </w:tcPr>
           <w:p>
             <w:r>
-              <w:t>/reviews</w:t>
+              <w:t>/api/v1/reviews</w:t>
             </w:r>
           </w:p>
         </w:tc>
@@ -466,7 +580,7 @@
           </w:tcPr>
           <w:p>
             <w:r>
-              <w:t>Lấy danh sách đánh giá</w:t>
+              <w:t>Lấy danh sách đánh giá theo địa điểm</w:t>
             </w:r>
           </w:p>
         </w:tc>
@@ -476,7 +590,7 @@
           </w:tcPr>
           <w:p>
             <w:r>
-              <w:t>place_id (query param)</w:t>
+              <w:t>place_id (query param, optional)</w:t>
             </w:r>
           </w:p>
         </w:tc>
@@ -486,7 +600,7 @@
           </w:tcPr>
           <w:p>
             <w:r>
-              <w:t>Danh sách ReviewResponse</w:t>
+              <w:t>{ place_id: int|null, items: list[ReviewResponse] }</w:t>
             </w:r>
           </w:p>
         </w:tc>
@@ -508,7 +622,7 @@
           </w:tcPr>
           <w:p>
             <w:r>
-              <w:t>/reviews</w:t>
+              <w:t>/api/v1/reviews</w:t>
             </w:r>
           </w:p>
         </w:tc>
@@ -528,7 +642,7 @@
           </w:tcPr>
           <w:p>
             <w:r>
-              <w:t>ReviewSubmitRequest</w:t>
+              <w:t>Bearer token; ReviewCreateRequest: place_id, content, rating, image_urls</w:t>
             </w:r>
           </w:p>
         </w:tc>
@@ -538,7 +652,7 @@
           </w:tcPr>
           <w:p>
             <w:r>
-              <w:t>message (str), average_rating (float), review_count (int), latest_review (ReviewResponse)</w:t>
+              <w:t>ReviewSubmitResponse: message, average_rating, review_count, latest_review (ReviewResponse)</w:t>
             </w:r>
           </w:p>
         </w:tc>
@@ -560,7 +674,7 @@
           </w:tcPr>
           <w:p>
             <w:r>
-              <w:t>/favorites</w:t>
+              <w:t>/api/v1/favorites</w:t>
             </w:r>
           </w:p>
         </w:tc>
@@ -580,7 +694,7 @@
           </w:tcPr>
           <w:p>
             <w:r>
-              <w:t>None</w:t>
+              <w:t>Bearer token</w:t>
             </w:r>
           </w:p>
         </w:tc>
@@ -590,7 +704,7 @@
           </w:tcPr>
           <w:p>
             <w:r>
-              <w:t>Danh sách PlaceResponse</w:t>
+              <w:t>{ items: list[place dict] } với id, name, address, rating, review_count, latitude, longitude, price_level, price_range, open_now, photo_url, contact_phone, primary_type</w:t>
             </w:r>
           </w:p>
         </w:tc>
@@ -612,7 +726,7 @@
           </w:tcPr>
           <w:p>
             <w:r>
-              <w:t>/favorites/{place_id}</w:t>
+              <w:t>/api/v1/favorites/{place_id}</w:t>
             </w:r>
           </w:p>
         </w:tc>
@@ -632,7 +746,7 @@
           </w:tcPr>
           <w:p>
             <w:r>
-              <w:t>place_id (path param)</w:t>
+              <w:t>Bearer token; place_id (path param)</w:t>
             </w:r>
           </w:p>
         </w:tc>
@@ -642,7 +756,59 @@
           </w:tcPr>
           <w:p>
             <w:r>
-              <w:t>Không có nội dung trả về (HTTP 204)</w:t>
+              <w:t>HTTP 204, không có body</w:t>
+            </w:r>
+          </w:p>
+        </w:tc>
+      </w:tr>
+      <w:tr>
+        <w:tc>
+          <w:tcPr>
+            <w:tcW w:type="dxa" w:w="1728"/>
+          </w:tcPr>
+          <w:p>
+            <w:r>
+              <w:t>DELETE</w:t>
+            </w:r>
+          </w:p>
+        </w:tc>
+        <w:tc>
+          <w:tcPr>
+            <w:tcW w:type="dxa" w:w="1728"/>
+          </w:tcPr>
+          <w:p>
+            <w:r>
+              <w:t>/api/v1/favorites/{place_id}</w:t>
+            </w:r>
+          </w:p>
+        </w:tc>
+        <w:tc>
+          <w:tcPr>
+            <w:tcW w:type="dxa" w:w="1728"/>
+          </w:tcPr>
+          <w:p>
+            <w:r>
+              <w:t>Xóa địa điểm khỏi danh sách yêu thích</w:t>
+            </w:r>
+          </w:p>
+        </w:tc>
+        <w:tc>
+          <w:tcPr>
+            <w:tcW w:type="dxa" w:w="1728"/>
+          </w:tcPr>
+          <w:p>
+            <w:r>
+              <w:t>Bearer token; place_id (path param)</w:t>
+            </w:r>
+          </w:p>
+        </w:tc>
+        <w:tc>
+          <w:tcPr>
+            <w:tcW w:type="dxa" w:w="1728"/>
+          </w:tcPr>
+          <w:p>
+            <w:r>
+              <w:t>HTTP 204, không có body</w:t>
             </w:r>
           </w:p>
         </w:tc>
@@ -664,7 +830,7 @@
           </w:tcPr>
           <w:p>
             <w:r>
-              <w:t>/place-requests</w:t>
+              <w:t>/api/v1/place-requests</w:t>
             </w:r>
           </w:p>
         </w:tc>
@@ -674,7 +840,7 @@
           </w:tcPr>
           <w:p>
             <w:r>
-              <w:t>Tạo yêu cầu thay đổi địa điểm</w:t>
+              <w:t>Tạo yêu cầu thêm/sửa/xóa địa điểm</w:t>
             </w:r>
           </w:p>
         </w:tc>
@@ -684,7 +850,7 @@
           </w:tcPr>
           <w:p>
             <w:r>
-              <w:t>PlaceChangeRequestCreate</w:t>
+              <w:t>Bearer token; PlaceChangeRequestCreate: request_type, place_id, title, category, address_text, latitude, longitude, price_range, price_level, website, phone, descriptions, request_note, review_content, review_rating, place_image_urls, review_image_urls</w:t>
             </w:r>
           </w:p>
         </w:tc>
@@ -694,7 +860,7 @@
           </w:tcPr>
           <w:p>
             <w:r>
-              <w:t>id (int), requester_user_id (int), requester_name (str|None), request_type (str), status (str), place_id (int|None), target_place_id (int|None), title (str|None), category (str|None), address_text (str|None), latitude (float|None), longitude (float|None), price_range (str|None), price_level (int|None), website (str|None), phone (str|None), descriptions (str|None), request_note (str|None), review_content (str|None), review_rating (int|None), place_image_urls (list[str]), review_image_urls (list[str]), admin_user_id (int|None), admin_note (str|None), created_at (str|None), reviewed_at (str|None)</w:t>
+              <w:t>PlaceChangeRequestResponse: id, requester_user_id, requester_name, request_type, status, place_id, target_place_id, title, category, address_text, latitude, longitude, price_range, price_level, website, phone, descriptions, request_note, review_content, review_rating, place_image_urls, review_image_urls, admin_user_id, admin_note, created_at, reviewed_at</w:t>
             </w:r>
           </w:p>
         </w:tc>
@@ -716,7 +882,7 @@
           </w:tcPr>
           <w:p>
             <w:r>
-              <w:t>/place-requests/my</w:t>
+              <w:t>/api/v1/place-requests/my</w:t>
             </w:r>
           </w:p>
         </w:tc>
@@ -726,7 +892,7 @@
           </w:tcPr>
           <w:p>
             <w:r>
-              <w:t>Lấy yêu cầu của tôi</w:t>
+              <w:t>Lấy các yêu cầu địa điểm của user hiện tại</w:t>
             </w:r>
           </w:p>
         </w:tc>
@@ -736,7 +902,7 @@
           </w:tcPr>
           <w:p>
             <w:r>
-              <w:t>None</w:t>
+              <w:t>Bearer token</w:t>
             </w:r>
           </w:p>
         </w:tc>
@@ -746,7 +912,7 @@
           </w:tcPr>
           <w:p>
             <w:r>
-              <w:t>Danh sách PlaceChangeRequestResponse</w:t>
+              <w:t>list[PlaceChangeRequestResponse]</w:t>
             </w:r>
           </w:p>
         </w:tc>
@@ -768,7 +934,7 @@
           </w:tcPr>
           <w:p>
             <w:r>
-              <w:t>/admin/me</w:t>
+              <w:t>/api/v1/admin/me</w:t>
             </w:r>
           </w:p>
         </w:tc>
@@ -778,7 +944,7 @@
           </w:tcPr>
           <w:p>
             <w:r>
-              <w:t>Lấy hồ sơ admin</w:t>
+              <w:t>Lấy hồ sơ admin của user hiện tại</w:t>
             </w:r>
           </w:p>
         </w:tc>
@@ -788,7 +954,7 @@
           </w:tcPr>
           <w:p>
             <w:r>
-              <w:t>None</w:t>
+              <w:t>Bearer token</w:t>
             </w:r>
           </w:p>
         </w:tc>
@@ -798,7 +964,7 @@
           </w:tcPr>
           <w:p>
             <w:r>
-              <w:t>user_id (int), status (str|None), role (str|None), approved_by (int|None), approved_at (str|None)</w:t>
+              <w:t>AdminProfileResponse: user_id, status, role, approved_by, approved_at</w:t>
             </w:r>
           </w:p>
         </w:tc>
@@ -820,7 +986,7 @@
           </w:tcPr>
           <w:p>
             <w:r>
-              <w:t>/admin/apply</w:t>
+              <w:t>/api/v1/admin/apply</w:t>
             </w:r>
           </w:p>
         </w:tc>
@@ -830,7 +996,7 @@
           </w:tcPr>
           <w:p>
             <w:r>
-              <w:t>Đăng ký làm admin</w:t>
+              <w:t>Đăng ký quyền admin</w:t>
             </w:r>
           </w:p>
         </w:tc>
@@ -840,7 +1006,7 @@
           </w:tcPr>
           <w:p>
             <w:r>
-              <w:t>None</w:t>
+              <w:t>Bearer token</w:t>
             </w:r>
           </w:p>
         </w:tc>
@@ -850,7 +1016,7 @@
           </w:tcPr>
           <w:p>
             <w:r>
-              <w:t>user_id (int), status (str|None), role (str|None), approved_by (int|None), approved_at (str|None)</w:t>
+              <w:t>AdminProfileResponse: user_id, status, role, approved_by, approved_at</w:t>
             </w:r>
           </w:p>
         </w:tc>
@@ -872,7 +1038,7 @@
           </w:tcPr>
           <w:p>
             <w:r>
-              <w:t>/admin/members</w:t>
+              <w:t>/api/v1/admin/members</w:t>
             </w:r>
           </w:p>
         </w:tc>
@@ -882,7 +1048,7 @@
           </w:tcPr>
           <w:p>
             <w:r>
-              <w:t>Lấy danh sách thành viên admin</w:t>
+              <w:t>Lấy danh sách thành viên/admin request</w:t>
             </w:r>
           </w:p>
         </w:tc>
@@ -892,7 +1058,7 @@
           </w:tcPr>
           <w:p>
             <w:r>
-              <w:t>None</w:t>
+              <w:t>Bearer token admin</w:t>
             </w:r>
           </w:p>
         </w:tc>
@@ -902,7 +1068,7 @@
           </w:tcPr>
           <w:p>
             <w:r>
-              <w:t>Danh sách AdminMemberResponse</w:t>
+              <w:t>list[AdminMemberResponse]: user_id, status, role, approved_by, approved_at, user_name, email</w:t>
             </w:r>
           </w:p>
         </w:tc>
@@ -924,7 +1090,7 @@
           </w:tcPr>
           <w:p>
             <w:r>
-              <w:t>/admin/members/{user_id}/approve</w:t>
+              <w:t>/api/v1/admin/members/{user_id}/approve</w:t>
             </w:r>
           </w:p>
         </w:tc>
@@ -944,7 +1110,7 @@
           </w:tcPr>
           <w:p>
             <w:r>
-              <w:t>user_id (path param)</w:t>
+              <w:t>Bearer token admin; user_id (path param)</w:t>
             </w:r>
           </w:p>
         </w:tc>
@@ -954,7 +1120,7 @@
           </w:tcPr>
           <w:p>
             <w:r>
-              <w:t>user_id (int), status (str|None), role (str|None), approved_by (int|None), approved_at (str|None)</w:t>
+              <w:t>AdminProfileResponse: user_id, status, role, approved_by, approved_at</w:t>
             </w:r>
           </w:p>
         </w:tc>
@@ -976,7 +1142,7 @@
           </w:tcPr>
           <w:p>
             <w:r>
-              <w:t>/admin/members/{user_id}/reject</w:t>
+              <w:t>/api/v1/admin/members/{user_id}/reject</w:t>
             </w:r>
           </w:p>
         </w:tc>
@@ -996,7 +1162,7 @@
           </w:tcPr>
           <w:p>
             <w:r>
-              <w:t>user_id (path param)</w:t>
+              <w:t>Bearer token admin; user_id (path param)</w:t>
             </w:r>
           </w:p>
         </w:tc>
@@ -1006,7 +1172,7 @@
           </w:tcPr>
           <w:p>
             <w:r>
-              <w:t>user_id (int), status (str|None), role (str|None), approved_by (int|None), approved_at (str|None)</w:t>
+              <w:t>AdminProfileResponse: user_id, status, role, approved_by, approved_at</w:t>
             </w:r>
           </w:p>
         </w:tc>
@@ -1028,7 +1194,7 @@
           </w:tcPr>
           <w:p>
             <w:r>
-              <w:t>/admin/place-requests</w:t>
+              <w:t>/api/v1/admin/place-requests</w:t>
             </w:r>
           </w:p>
         </w:tc>
@@ -1038,7 +1204,7 @@
           </w:tcPr>
           <w:p>
             <w:r>
-              <w:t>Lấy yêu cầu thay đổi địa điểm</w:t>
+              <w:t>Lấy danh sách yêu cầu thay đổi địa điểm</w:t>
             </w:r>
           </w:p>
         </w:tc>
@@ -1048,7 +1214,7 @@
           </w:tcPr>
           <w:p>
             <w:r>
-              <w:t>None</w:t>
+              <w:t>Bearer token admin; status_filter (query param optional: pending, approved, rejected)</w:t>
             </w:r>
           </w:p>
         </w:tc>
@@ -1058,7 +1224,7 @@
           </w:tcPr>
           <w:p>
             <w:r>
-              <w:t>Danh sách PlaceChangeRequestResponse</w:t>
+              <w:t>list[PlaceChangeRequestResponse]</w:t>
             </w:r>
           </w:p>
         </w:tc>
@@ -1080,7 +1246,7 @@
           </w:tcPr>
           <w:p>
             <w:r>
-              <w:t>/admin/place-requests/{request_id}/approve</w:t>
+              <w:t>/api/v1/admin/place-requests/{request_id}/approve</w:t>
             </w:r>
           </w:p>
         </w:tc>
@@ -1100,7 +1266,7 @@
           </w:tcPr>
           <w:p>
             <w:r>
-              <w:t>request_id (path param)</w:t>
+              <w:t>Bearer token admin; request_id (path param); AdminDecisionRequest: note</w:t>
             </w:r>
           </w:p>
         </w:tc>
@@ -1110,7 +1276,7 @@
           </w:tcPr>
           <w:p>
             <w:r>
-              <w:t>id (int), requester_user_id (int), requester_name (str|None), request_type (str), status (str), place_id (int|None), target_place_id (int|None), title (str|None), category (str|None), address_text (str|None), latitude (float|None), longitude (float|None), price_range (str|None), price_level (int|None), website (str|None), phone (str|None), descriptions (str|None), request_note (str|None), review_content (str|None), review_rating (int|None), place_image_urls (list[str]), review_image_urls (list[str]), admin_user_id (int|None), admin_note (str|None), created_at (str|None), reviewed_at (str|None)</w:t>
+              <w:t>PlaceChangeRequestResponse: id, requester_user_id, requester_name, request_type, status, place_id, target_place_id, title, category, address_text, latitude, longitude, price_range, price_level, website, phone, descriptions, request_note, review_content, review_rating, place_image_urls, review_image_urls, admin_user_id, admin_note, created_at, reviewed_at</w:t>
             </w:r>
           </w:p>
         </w:tc>
@@ -1132,7 +1298,7 @@
           </w:tcPr>
           <w:p>
             <w:r>
-              <w:t>/admin/place-requests/{request_id}/reject</w:t>
+              <w:t>/api/v1/admin/place-requests/{request_id}/reject</w:t>
             </w:r>
           </w:p>
         </w:tc>
@@ -1152,7 +1318,7 @@
           </w:tcPr>
           <w:p>
             <w:r>
-              <w:t>request_id (path param)</w:t>
+              <w:t>Bearer token admin; request_id (path param); AdminDecisionRequest: note</w:t>
             </w:r>
           </w:p>
         </w:tc>
@@ -1162,7 +1328,7 @@
           </w:tcPr>
           <w:p>
             <w:r>
-              <w:t>id (int), requester_user_id (int), requester_name (str|None), request_type (str), status (str), place_id (int|None), target_place_id (int|None), title (str|None), category (str|None), address_text (str|None), latitude (float|None), longitude (float|None), price_range (str|None), price_level (int|None), website (str|None), phone (str|None), descriptions (str|None), request_note (str|None), review_content (str|None), review_rating (int|None), place_image_urls (list[str]), review_image_urls (list[str]), admin_user_id (int|None), admin_note (str|None), created_at (str|None), reviewed_at (str|None)</w:t>
+              <w:t>PlaceChangeRequestResponse: id, requester_user_id, requester_name, request_type, status, place_id, target_place_id, title, category, address_text, latitude, longitude, price_range, price_level, website, phone, descriptions, request_note, review_content, review_rating, place_image_urls, review_image_urls, admin_user_id, admin_note, created_at, reviewed_at</w:t>
             </w:r>
           </w:p>
         </w:tc>
@@ -1184,7 +1350,7 @@
           </w:tcPr>
           <w:p>
             <w:r>
-              <w:t>/uploads/avatar</w:t>
+              <w:t>/api/v1/uploads/avatar</w:t>
             </w:r>
           </w:p>
         </w:tc>
@@ -1194,7 +1360,7 @@
           </w:tcPr>
           <w:p>
             <w:r>
-              <w:t>Tải lên avatar</w:t>
+              <w:t>Tải lên avatar và cập nhật user</w:t>
             </w:r>
           </w:p>
         </w:tc>
@@ -1204,7 +1370,7 @@
           </w:tcPr>
           <w:p>
             <w:r>
-              <w:t>file (multipart)</w:t>
+              <w:t>Bearer token; multipart file field: file</w:t>
             </w:r>
           </w:p>
         </w:tc>
@@ -1214,7 +1380,7 @@
           </w:tcPr>
           <w:p>
             <w:r>
-              <w:t>url (str), filename (str), content_type (str), size_bytes (int), user (UserResponse)</w:t>
+              <w:t>AvatarUploadResponse: url, filename, content_type, size_bytes, user (UserResponse)</w:t>
             </w:r>
           </w:p>
         </w:tc>
@@ -1236,7 +1402,7 @@
           </w:tcPr>
           <w:p>
             <w:r>
-              <w:t>/uploads/place-images</w:t>
+              <w:t>/api/v1/uploads/place-images</w:t>
             </w:r>
           </w:p>
         </w:tc>
@@ -1246,7 +1412,7 @@
           </w:tcPr>
           <w:p>
             <w:r>
-              <w:t>Tải lên hình ảnh địa điểm</w:t>
+              <w:t>Tải lên ảnh cho yêu cầu địa điểm</w:t>
             </w:r>
           </w:p>
         </w:tc>
@@ -1256,7 +1422,7 @@
           </w:tcPr>
           <w:p>
             <w:r>
-              <w:t>files (multipart)</w:t>
+              <w:t>Bearer token; multipart file fields: files</w:t>
             </w:r>
           </w:p>
         </w:tc>
@@ -1266,7 +1432,7 @@
           </w:tcPr>
           <w:p>
             <w:r>
-              <w:t>items (list[UploadedImageResponse]), urls (list[str])</w:t>
+              <w:t>UploadedImagesResponse: items (list[UploadedImageResponse]), urls (list[str])</w:t>
             </w:r>
           </w:p>
         </w:tc>
@@ -1288,7 +1454,7 @@
           </w:tcPr>
           <w:p>
             <w:r>
-              <w:t>/uploads/review-images</w:t>
+              <w:t>/api/v1/uploads/review-images</w:t>
             </w:r>
           </w:p>
         </w:tc>
@@ -1298,7 +1464,7 @@
           </w:tcPr>
           <w:p>
             <w:r>
-              <w:t>Tải lên hình ảnh đánh giá</w:t>
+              <w:t>Tải lên ảnh cho review</w:t>
             </w:r>
           </w:p>
         </w:tc>
@@ -1308,7 +1474,7 @@
           </w:tcPr>
           <w:p>
             <w:r>
-              <w:t>files (multipart)</w:t>
+              <w:t>Bearer token; multipart file fields: files</w:t>
             </w:r>
           </w:p>
         </w:tc>
@@ -1318,7 +1484,7 @@
           </w:tcPr>
           <w:p>
             <w:r>
-              <w:t>items (list[UploadedImageResponse]), urls (list[str])</w:t>
+              <w:t>UploadedImagesResponse: items (list[UploadedImageResponse]), urls (list[str])</w:t>
             </w:r>
           </w:p>
         </w:tc>
@@ -1340,7 +1506,7 @@
           </w:tcPr>
           <w:p>
             <w:r>
-              <w:t>/uploads/places/{place_id}/images</w:t>
+              <w:t>/api/v1/uploads/places/{place_id}/images</w:t>
             </w:r>
           </w:p>
         </w:tc>
@@ -1350,7 +1516,7 @@
           </w:tcPr>
           <w:p>
             <w:r>
-              <w:t>Cập nhật hình ảnh địa điểm</w:t>
+              <w:t>Thay toàn bộ ảnh của một địa điểm</w:t>
             </w:r>
           </w:p>
         </w:tc>
@@ -1360,7 +1526,7 @@
           </w:tcPr>
           <w:p>
             <w:r>
-              <w:t>images (JSON)</w:t>
+              <w:t>Bearer token admin; place_id (path param); multipart file fields: files</w:t>
             </w:r>
           </w:p>
         </w:tc>
@@ -1370,7 +1536,7 @@
           </w:tcPr>
           <w:p>
             <w:r>
-              <w:t>place_id (int), image_urls (list[str])</w:t>
+              <w:t>PlaceImagesUpdateResponse: place_id, image_urls</w:t>
             </w:r>
           </w:p>
         </w:tc>
@@ -1392,7 +1558,7 @@
           </w:tcPr>
           <w:p>
             <w:r>
-              <w:t>/weather</w:t>
+              <w:t>/api/v1/weather</w:t>
             </w:r>
           </w:p>
         </w:tc>
@@ -1402,7 +1568,7 @@
           </w:tcPr>
           <w:p>
             <w:r>
-              <w:t>Lấy thông tin thời tiết</w:t>
+              <w:t>Lấy thông tin thời tiết từ Open-Meteo</w:t>
             </w:r>
           </w:p>
         </w:tc>
@@ -1412,7 +1578,7 @@
           </w:tcPr>
           <w:p>
             <w:r>
-              <w:t>latitude, longitude (query params)</w:t>
+              <w:t>query params: city (optional), latitude, longitude. Muốn có dữ liệu thật cần latitude và longitude</w:t>
             </w:r>
           </w:p>
         </w:tc>
@@ -1422,7 +1588,7 @@
           </w:tcPr>
           <w:p>
             <w:r>
-              <w:t>city (str), condition (str), temperature_c (float|None), rain_probability (float|None)</w:t>
+              <w:t>city (str), condition (str), temperature_c (float|null), rain_probability (float|null)</w:t>
             </w:r>
           </w:p>
         </w:tc>

</xml_diff>